<commit_message>
Mary's comments on SOW
</commit_message>
<xml_diff>
--- a/Reports/Guth-SOW-Erin.docx
+++ b/Reports/Guth-SOW-Erin.docx
@@ -117,17 +117,20 @@
             <w:pPr>
               <w:rPr>
                 <w:rFonts w:cs="Arial"/>
+                <w:lang w:val="sv-SE"/>
               </w:rPr>
             </w:pPr>
             <w:r>
               <w:rPr>
                 <w:rFonts w:cs="Arial"/>
+                <w:lang w:val="sv-SE"/>
               </w:rPr>
               <w:t>Erin Cooper</w:t>
             </w:r>
             <w:r>
               <w:rPr>
                 <w:rFonts w:cs="Arial"/>
+                <w:lang w:val="sv-SE"/>
               </w:rPr>
               <w:br/>
             </w:r>
@@ -135,6 +138,7 @@
               <w:r>
                 <w:rPr>
                   <w:rStyle w:val="Hyperlink"/>
+                  <w:lang w:val="sv-SE"/>
                 </w:rPr>
                 <w:t>erin.cooper</w:t>
               </w:r>
@@ -142,6 +146,7 @@
                 <w:rPr>
                   <w:rStyle w:val="Hyperlink"/>
                   <w:rFonts w:cs="Arial"/>
+                  <w:lang w:val="sv-SE"/>
                 </w:rPr>
                 <w:t>@cuanschutz.edu</w:t>
               </w:r>
@@ -412,8 +417,21 @@
       <w:pPr>
         <w:pStyle w:val="Heading3"/>
       </w:pPr>
-      <w:r>
-        <w:t>Description of the Data</w:t>
+      <w:commentRangeStart w:id="0"/>
+      <w:r>
+        <w:t xml:space="preserve">Description </w:t>
+      </w:r>
+      <w:commentRangeEnd w:id="0"/>
+      <w:r>
+        <w:rPr>
+          <w:rStyle w:val="CommentReference"/>
+          <w:sz w:val="24"/>
+          <w:szCs w:val="24"/>
+        </w:rPr>
+        <w:commentReference w:id="0"/>
+      </w:r>
+      <w:r>
+        <w:t>of the Data</w:t>
       </w:r>
     </w:p>
     <w:p>
@@ -499,19 +517,67 @@
     <w:p>
       <w:r>
         <w:tab/>
-        <w:t xml:space="preserve">The data will first be checked and explored. If the data is confirmed to be adequately clean, then two linear regression models will be fit using the averages of the physical exam score as the outcome for one, and the averages of the communication score as the outcome for the other. The primary predictor used in this model will be a categorical variable describing whether a student is URiM. In addition, gender will be included as a </w:t>
+        <w:t xml:space="preserve">The data will first be checked and explored. If the data is confirmed to be </w:t>
+      </w:r>
+      <w:commentRangeStart w:id="1"/>
+      <w:r>
+        <w:t>adequately clean,</w:t>
+      </w:r>
+      <w:commentRangeEnd w:id="1"/>
+      <w:r>
+        <w:rPr>
+          <w:rStyle w:val="CommentReference"/>
+          <w:sz w:val="22"/>
+          <w:szCs w:val="22"/>
+        </w:rPr>
+        <w:commentReference w:id="1"/>
+      </w:r>
+      <w:r>
+        <w:t xml:space="preserve"> then two</w:t>
+      </w:r>
+      <w:commentRangeStart w:id="2"/>
+      <w:r>
+        <w:t xml:space="preserve"> linear </w:t>
+      </w:r>
+      <w:commentRangeEnd w:id="2"/>
+      <w:r>
+        <w:rPr>
+          <w:rStyle w:val="CommentReference"/>
+          <w:sz w:val="22"/>
+          <w:szCs w:val="22"/>
+        </w:rPr>
+        <w:commentReference w:id="2"/>
+      </w:r>
+      <w:r>
+        <w:t xml:space="preserve">regression models will be fit using the averages of the physical exam score as the outcome for one, and the averages of the communication score as the outcome for the other. The primary predictor used in this model will be a categorical variable describing whether a student is URiM. In addition, gender will be included as a </w:t>
       </w:r>
       <w:r>
         <w:t xml:space="preserve">covariate to confirm that there is no gender-based bias. Since USMLE scores and clerkship scores were of interest, these results will be assessed using </w:t>
       </w:r>
       <w:r>
         <w:lastRenderedPageBreak/>
-        <w:t xml:space="preserve">separate linear regression models, using the same covariate and primary predictor. Since many t-tests are being conducted using these models, a family-wise error rate correction will be applied to the tests of significance. </w:t>
+        <w:t>separate linear regression models, using the same covariate and primary predictor. Since many t-tests are being conducted using these models,</w:t>
+      </w:r>
+      <w:commentRangeStart w:id="3"/>
+      <w:r>
+        <w:t xml:space="preserve"> a family-wise error rate correction</w:t>
+      </w:r>
+      <w:commentRangeEnd w:id="3"/>
+      <w:r>
+        <w:rPr>
+          <w:rStyle w:val="CommentReference"/>
+          <w:sz w:val="22"/>
+          <w:szCs w:val="22"/>
+        </w:rPr>
+        <w:commentReference w:id="3"/>
+      </w:r>
+      <w:r>
+        <w:t xml:space="preserve"> will be applied to the tests of significance. </w:t>
       </w:r>
     </w:p>
     <w:sectPr>
-      <w:headerReference w:type="default" r:id="rId12"/>
-      <w:footerReference w:type="default" r:id="rId13"/>
+      <w:headerReference w:type="default" r:id="rId16"/>
+      <w:footerReference w:type="default" r:id="rId17"/>
       <w:pgSz w:w="12240" w:h="15840"/>
       <w:pgMar w:top="720" w:right="720" w:bottom="720" w:left="720" w:header="720" w:footer="720" w:gutter="0"/>
       <w:cols w:space="720"/>
@@ -519,6 +585,102 @@
     </w:sectPr>
   </w:body>
 </w:document>
+</file>
+
+<file path=word/comments.xml><?xml version="1.0" encoding="utf-8"?>
+<w:comments xmlns:wpc="http://schemas.microsoft.com/office/word/2010/wordprocessingCanvas" xmlns:cx="http://schemas.microsoft.com/office/drawing/2014/chartex" xmlns:cx1="http://schemas.microsoft.com/office/drawing/2015/9/8/chartex" xmlns:cx2="http://schemas.microsoft.com/office/drawing/2015/10/21/chartex" xmlns:cx3="http://schemas.microsoft.com/office/drawing/2016/5/9/chartex" xmlns:cx4="http://schemas.microsoft.com/office/drawing/2016/5/10/chartex" xmlns:cx5="http://schemas.microsoft.com/office/drawing/2016/5/11/chartex" xmlns:cx6="http://schemas.microsoft.com/office/drawing/2016/5/12/chartex" xmlns:cx7="http://schemas.microsoft.com/office/drawing/2016/5/13/chartex" xmlns:cx8="http://schemas.microsoft.com/office/drawing/2016/5/14/chartex" xmlns:mc="http://schemas.openxmlformats.org/markup-compatibility/2006" xmlns:aink="http://schemas.microsoft.com/office/drawing/2016/ink" xmlns:am3d="http://schemas.microsoft.com/office/drawing/2017/model3d" xmlns:o="urn:schemas-microsoft-com:office:office" xmlns:oel="http://schemas.microsoft.com/office/2019/extlst" xmlns:r="http://schemas.openxmlformats.org/officeDocument/2006/relationships" xmlns:m="http://schemas.openxmlformats.org/officeDocument/2006/math" xmlns:v="urn:schemas-microsoft-com:vml" xmlns:wp14="http://schemas.microsoft.com/office/word/2010/wordprocessingDrawing" xmlns:wp="http://schemas.openxmlformats.org/drawingml/2006/wordprocessingDrawing" xmlns:w10="urn:schemas-microsoft-com:office:word" xmlns:w="http://schemas.openxmlformats.org/wordprocessingml/2006/main" xmlns:w14="http://schemas.microsoft.com/office/word/2010/wordml" xmlns:w15="http://schemas.microsoft.com/office/word/2012/wordml" xmlns:w16cex="http://schemas.microsoft.com/office/word/2018/wordml/cex" xmlns:w16cid="http://schemas.microsoft.com/office/word/2016/wordml/cid" xmlns:w16="http://schemas.microsoft.com/office/word/2018/wordml" xmlns:w16du="http://schemas.microsoft.com/office/word/2023/wordml/word16du" xmlns:w16sdtdh="http://schemas.microsoft.com/office/word/2020/wordml/sdtdatahash" xmlns:w16sdtfl="http://schemas.microsoft.com/office/word/2024/wordml/sdtformatlock" xmlns:w16se="http://schemas.microsoft.com/office/word/2015/wordml/symex" xmlns:wpg="http://schemas.microsoft.com/office/word/2010/wordprocessingGroup" xmlns:wpi="http://schemas.microsoft.com/office/word/2010/wordprocessingInk" xmlns:wne="http://schemas.microsoft.com/office/word/2006/wordml" xmlns:wps="http://schemas.microsoft.com/office/word/2010/wordprocessingShape" mc:Ignorable="w14 w15 w16se w16cid w16 w16cex w16sdtdh w16sdtfl w16du wp14">
+  <w:comment w:id="0" w:author="Sammel, Mary" w:date="2026-10-20T15:02:00Z" w:initials="MS">
+    <w:p>
+      <w:pPr>
+        <w:pStyle w:val="CommentText"/>
+      </w:pPr>
+      <w:r>
+        <w:rPr>
+          <w:rStyle w:val="CommentReference"/>
+        </w:rPr>
+        <w:annotationRef/>
+      </w:r>
+      <w:r>
+        <w:t>Describe sample size, #variables, variables you’ve computed.  Have you made exclusions?</w:t>
+      </w:r>
+    </w:p>
+  </w:comment>
+  <w:comment w:id="1" w:author="Sammel, Mary" w:date="2026-10-20T13:47:00Z" w:initials="MS">
+    <w:p>
+      <w:pPr>
+        <w:pStyle w:val="CommentText"/>
+      </w:pPr>
+      <w:r>
+        <w:rPr>
+          <w:rStyle w:val="CommentReference"/>
+        </w:rPr>
+        <w:annotationRef/>
+      </w:r>
+      <w:r>
+        <w:t>This vague.  You will also need to evaluate modeling assumptions for regression, i.e. normality</w:t>
+      </w:r>
+    </w:p>
+  </w:comment>
+  <w:comment w:id="2" w:author="Sammel, Mary" w:date="2026-10-20T13:48:00Z" w:initials="MS">
+    <w:p>
+      <w:pPr>
+        <w:pStyle w:val="CommentText"/>
+      </w:pPr>
+      <w:r>
+        <w:rPr>
+          <w:rStyle w:val="CommentReference"/>
+        </w:rPr>
+        <w:annotationRef/>
+      </w:r>
+      <w:r>
+        <w:t>Are you averaging scores over time?</w:t>
+      </w:r>
+    </w:p>
+  </w:comment>
+  <w:comment w:id="3" w:author="Sammel, Mary" w:date="2026-10-20T13:49:00Z" w:initials="MS">
+    <w:p>
+      <w:pPr>
+        <w:pStyle w:val="CommentText"/>
+      </w:pPr>
+      <w:r>
+        <w:rPr>
+          <w:rStyle w:val="CommentReference"/>
+        </w:rPr>
+        <w:annotationRef/>
+      </w:r>
+      <w:r>
+        <w:t xml:space="preserve">Needs more detail...across all outcomes considered, or are you grouping “types” of outcomes?  </w:t>
+      </w:r>
+    </w:p>
+  </w:comment>
+</w:comments>
+</file>
+
+<file path=word/commentsExtended.xml><?xml version="1.0" encoding="utf-8"?>
+<w15:commentsEx xmlns:wpc="http://schemas.microsoft.com/office/word/2010/wordprocessingCanvas" xmlns:cx="http://schemas.microsoft.com/office/drawing/2014/chartex" xmlns:cx1="http://schemas.microsoft.com/office/drawing/2015/9/8/chartex" xmlns:cx2="http://schemas.microsoft.com/office/drawing/2015/10/21/chartex" xmlns:cx3="http://schemas.microsoft.com/office/drawing/2016/5/9/chartex" xmlns:cx4="http://schemas.microsoft.com/office/drawing/2016/5/10/chartex" xmlns:cx5="http://schemas.microsoft.com/office/drawing/2016/5/11/chartex" xmlns:cx6="http://schemas.microsoft.com/office/drawing/2016/5/12/chartex" xmlns:cx7="http://schemas.microsoft.com/office/drawing/2016/5/13/chartex" xmlns:cx8="http://schemas.microsoft.com/office/drawing/2016/5/14/chartex" xmlns:mc="http://schemas.openxmlformats.org/markup-compatibility/2006" xmlns:aink="http://schemas.microsoft.com/office/drawing/2016/ink" xmlns:am3d="http://schemas.microsoft.com/office/drawing/2017/model3d" xmlns:o="urn:schemas-microsoft-com:office:office" xmlns:oel="http://schemas.microsoft.com/office/2019/extlst" xmlns:r="http://schemas.openxmlformats.org/officeDocument/2006/relationships" xmlns:m="http://schemas.openxmlformats.org/officeDocument/2006/math" xmlns:v="urn:schemas-microsoft-com:vml" xmlns:wp14="http://schemas.microsoft.com/office/word/2010/wordprocessingDrawing" xmlns:wp="http://schemas.openxmlformats.org/drawingml/2006/wordprocessingDrawing" xmlns:w10="urn:schemas-microsoft-com:office:word" xmlns:w="http://schemas.openxmlformats.org/wordprocessingml/2006/main" xmlns:w14="http://schemas.microsoft.com/office/word/2010/wordml" xmlns:w15="http://schemas.microsoft.com/office/word/2012/wordml" xmlns:w16cex="http://schemas.microsoft.com/office/word/2018/wordml/cex" xmlns:w16cid="http://schemas.microsoft.com/office/word/2016/wordml/cid" xmlns:w16="http://schemas.microsoft.com/office/word/2018/wordml" xmlns:w16du="http://schemas.microsoft.com/office/word/2023/wordml/word16du" xmlns:w16sdtdh="http://schemas.microsoft.com/office/word/2020/wordml/sdtdatahash" xmlns:w16sdtfl="http://schemas.microsoft.com/office/word/2024/wordml/sdtformatlock" xmlns:w16se="http://schemas.microsoft.com/office/word/2015/wordml/symex" xmlns:wpg="http://schemas.microsoft.com/office/word/2010/wordprocessingGroup" xmlns:wpi="http://schemas.microsoft.com/office/word/2010/wordprocessingInk" xmlns:wne="http://schemas.microsoft.com/office/word/2006/wordml" xmlns:wps="http://schemas.microsoft.com/office/word/2010/wordprocessingShape" mc:Ignorable="w14 w15 w16se w16cid w16 w16cex w16sdtdh w16sdtfl w16du wp14">
+  <w15:commentEx w15:paraId="76CDFCD8" w15:done="0"/>
+  <w15:commentEx w15:paraId="57895F0C" w15:done="0"/>
+  <w15:commentEx w15:paraId="73D69874" w15:done="0"/>
+  <w15:commentEx w15:paraId="1176FB82" w15:done="0"/>
+</w15:commentsEx>
+</file>
+
+<file path=word/commentsExtensible.xml><?xml version="1.0" encoding="utf-8"?>
+<w16cex:commentsExtensible xmlns:wpc="http://schemas.microsoft.com/office/word/2010/wordprocessingCanvas" xmlns:cx="http://schemas.microsoft.com/office/drawing/2014/chartex" xmlns:cx1="http://schemas.microsoft.com/office/drawing/2015/9/8/chartex" xmlns:cx2="http://schemas.microsoft.com/office/drawing/2015/10/21/chartex" xmlns:cx3="http://schemas.microsoft.com/office/drawing/2016/5/9/chartex" xmlns:cx4="http://schemas.microsoft.com/office/drawing/2016/5/10/chartex" xmlns:cx5="http://schemas.microsoft.com/office/drawing/2016/5/11/chartex" xmlns:cx6="http://schemas.microsoft.com/office/drawing/2016/5/12/chartex" xmlns:cx7="http://schemas.microsoft.com/office/drawing/2016/5/13/chartex" xmlns:cx8="http://schemas.microsoft.com/office/drawing/2016/5/14/chartex" xmlns:cr="http://schemas.microsoft.com/office/comments/2020/reactions" xmlns:mc="http://schemas.openxmlformats.org/markup-compatibility/2006" xmlns:aink="http://schemas.microsoft.com/office/drawing/2016/ink" xmlns:am3d="http://schemas.microsoft.com/office/drawing/2017/model3d" xmlns:o="urn:schemas-microsoft-com:office:office" xmlns:oel="http://schemas.microsoft.com/office/2019/extlst" xmlns:r="http://schemas.openxmlformats.org/officeDocument/2006/relationships" xmlns:m="http://schemas.openxmlformats.org/officeDocument/2006/math" xmlns:v="urn:schemas-microsoft-com:vml" xmlns:wp14="http://schemas.microsoft.com/office/word/2010/wordprocessingDrawing" xmlns:wp="http://schemas.openxmlformats.org/drawingml/2006/wordprocessingDrawing" xmlns:w10="urn:schemas-microsoft-com:office:word" xmlns:w="http://schemas.openxmlformats.org/wordprocessingml/2006/main" xmlns:w14="http://schemas.microsoft.com/office/word/2010/wordml" xmlns:w15="http://schemas.microsoft.com/office/word/2012/wordml" xmlns:w16cex="http://schemas.microsoft.com/office/word/2018/wordml/cex" xmlns:w16cid="http://schemas.microsoft.com/office/word/2016/wordml/cid" xmlns:w16="http://schemas.microsoft.com/office/word/2018/wordml" xmlns:w16du="http://schemas.microsoft.com/office/word/2023/wordml/word16du" xmlns:w16sdtdh="http://schemas.microsoft.com/office/word/2020/wordml/sdtdatahash" xmlns:w16sdtfl="http://schemas.microsoft.com/office/word/2024/wordml/sdtformatlock" xmlns:w16se="http://schemas.microsoft.com/office/word/2015/wordml/symex" xmlns:wpg="http://schemas.microsoft.com/office/word/2010/wordprocessingGroup" xmlns:wpi="http://schemas.microsoft.com/office/word/2010/wordprocessingInk" xmlns:wne="http://schemas.microsoft.com/office/word/2006/wordml" xmlns:wps="http://schemas.microsoft.com/office/word/2010/wordprocessingShape" mc:Ignorable="w14 w15 w16se w16cid w16 w16cex w16sdtdh w16sdtfl cr w16du wp14">
+  <w16cex:commentExtensible w16cex:durableId="763D74C1" w16cex:dateUtc="2026-10-20T21:02:00Z"/>
+  <w16cex:commentExtensible w16cex:durableId="72458827" w16cex:dateUtc="2026-10-20T19:47:00Z"/>
+  <w16cex:commentExtensible w16cex:durableId="2AB3FD26" w16cex:dateUtc="2026-10-20T19:48:00Z"/>
+  <w16cex:commentExtensible w16cex:durableId="4199B9FE" w16cex:dateUtc="2026-10-20T19:49:00Z"/>
+</w16cex:commentsExtensible>
+</file>
+
+<file path=word/commentsIds.xml><?xml version="1.0" encoding="utf-8"?>
+<w16cid:commentsIds xmlns:wpc="http://schemas.microsoft.com/office/word/2010/wordprocessingCanvas" xmlns:cx="http://schemas.microsoft.com/office/drawing/2014/chartex" xmlns:cx1="http://schemas.microsoft.com/office/drawing/2015/9/8/chartex" xmlns:cx2="http://schemas.microsoft.com/office/drawing/2015/10/21/chartex" xmlns:cx3="http://schemas.microsoft.com/office/drawing/2016/5/9/chartex" xmlns:cx4="http://schemas.microsoft.com/office/drawing/2016/5/10/chartex" xmlns:cx5="http://schemas.microsoft.com/office/drawing/2016/5/11/chartex" xmlns:cx6="http://schemas.microsoft.com/office/drawing/2016/5/12/chartex" xmlns:cx7="http://schemas.microsoft.com/office/drawing/2016/5/13/chartex" xmlns:cx8="http://schemas.microsoft.com/office/drawing/2016/5/14/chartex" xmlns:mc="http://schemas.openxmlformats.org/markup-compatibility/2006" xmlns:aink="http://schemas.microsoft.com/office/drawing/2016/ink" xmlns:am3d="http://schemas.microsoft.com/office/drawing/2017/model3d" xmlns:o="urn:schemas-microsoft-com:office:office" xmlns:oel="http://schemas.microsoft.com/office/2019/extlst" xmlns:r="http://schemas.openxmlformats.org/officeDocument/2006/relationships" xmlns:m="http://schemas.openxmlformats.org/officeDocument/2006/math" xmlns:v="urn:schemas-microsoft-com:vml" xmlns:wp14="http://schemas.microsoft.com/office/word/2010/wordprocessingDrawing" xmlns:wp="http://schemas.openxmlformats.org/drawingml/2006/wordprocessingDrawing" xmlns:w10="urn:schemas-microsoft-com:office:word" xmlns:w="http://schemas.openxmlformats.org/wordprocessingml/2006/main" xmlns:w14="http://schemas.microsoft.com/office/word/2010/wordml" xmlns:w15="http://schemas.microsoft.com/office/word/2012/wordml" xmlns:w16cex="http://schemas.microsoft.com/office/word/2018/wordml/cex" xmlns:w16cid="http://schemas.microsoft.com/office/word/2016/wordml/cid" xmlns:w16="http://schemas.microsoft.com/office/word/2018/wordml" xmlns:w16du="http://schemas.microsoft.com/office/word/2023/wordml/word16du" xmlns:w16sdtdh="http://schemas.microsoft.com/office/word/2020/wordml/sdtdatahash" xmlns:w16sdtfl="http://schemas.microsoft.com/office/word/2024/wordml/sdtformatlock" xmlns:w16se="http://schemas.microsoft.com/office/word/2015/wordml/symex" xmlns:wpg="http://schemas.microsoft.com/office/word/2010/wordprocessingGroup" xmlns:wpi="http://schemas.microsoft.com/office/word/2010/wordprocessingInk" xmlns:wne="http://schemas.microsoft.com/office/word/2006/wordml" xmlns:wps="http://schemas.microsoft.com/office/word/2010/wordprocessingShape" mc:Ignorable="w14 w15 w16se w16cid w16 w16cex w16sdtdh w16sdtfl w16du wp14">
+  <w16cid:commentId w16cid:paraId="76CDFCD8" w16cid:durableId="763D74C1"/>
+  <w16cid:commentId w16cid:paraId="57895F0C" w16cid:durableId="72458827"/>
+  <w16cid:commentId w16cid:paraId="73D69874" w16cid:durableId="2AB3FD26"/>
+  <w16cid:commentId w16cid:paraId="1176FB82" w16cid:durableId="4199B9FE"/>
+</w16cid:commentsIds>
 </file>
 
 <file path=word/endnotes.xml><?xml version="1.0" encoding="utf-8"?>
@@ -2229,6 +2391,14 @@
     <w:abstractNumId w:val="8"/>
   </w:num>
 </w:numbering>
+</file>
+
+<file path=word/people.xml><?xml version="1.0" encoding="utf-8"?>
+<w15:people xmlns:wpc="http://schemas.microsoft.com/office/word/2010/wordprocessingCanvas" xmlns:cx="http://schemas.microsoft.com/office/drawing/2014/chartex" xmlns:cx1="http://schemas.microsoft.com/office/drawing/2015/9/8/chartex" xmlns:cx2="http://schemas.microsoft.com/office/drawing/2015/10/21/chartex" xmlns:cx3="http://schemas.microsoft.com/office/drawing/2016/5/9/chartex" xmlns:cx4="http://schemas.microsoft.com/office/drawing/2016/5/10/chartex" xmlns:cx5="http://schemas.microsoft.com/office/drawing/2016/5/11/chartex" xmlns:cx6="http://schemas.microsoft.com/office/drawing/2016/5/12/chartex" xmlns:cx7="http://schemas.microsoft.com/office/drawing/2016/5/13/chartex" xmlns:cx8="http://schemas.microsoft.com/office/drawing/2016/5/14/chartex" xmlns:mc="http://schemas.openxmlformats.org/markup-compatibility/2006" xmlns:aink="http://schemas.microsoft.com/office/drawing/2016/ink" xmlns:am3d="http://schemas.microsoft.com/office/drawing/2017/model3d" xmlns:o="urn:schemas-microsoft-com:office:office" xmlns:oel="http://schemas.microsoft.com/office/2019/extlst" xmlns:r="http://schemas.openxmlformats.org/officeDocument/2006/relationships" xmlns:m="http://schemas.openxmlformats.org/officeDocument/2006/math" xmlns:v="urn:schemas-microsoft-com:vml" xmlns:wp14="http://schemas.microsoft.com/office/word/2010/wordprocessingDrawing" xmlns:wp="http://schemas.openxmlformats.org/drawingml/2006/wordprocessingDrawing" xmlns:w10="urn:schemas-microsoft-com:office:word" xmlns:w="http://schemas.openxmlformats.org/wordprocessingml/2006/main" xmlns:w14="http://schemas.microsoft.com/office/word/2010/wordml" xmlns:w15="http://schemas.microsoft.com/office/word/2012/wordml" xmlns:w16cex="http://schemas.microsoft.com/office/word/2018/wordml/cex" xmlns:w16cid="http://schemas.microsoft.com/office/word/2016/wordml/cid" xmlns:w16="http://schemas.microsoft.com/office/word/2018/wordml" xmlns:w16du="http://schemas.microsoft.com/office/word/2023/wordml/word16du" xmlns:w16sdtdh="http://schemas.microsoft.com/office/word/2020/wordml/sdtdatahash" xmlns:w16sdtfl="http://schemas.microsoft.com/office/word/2024/wordml/sdtformatlock" xmlns:w16se="http://schemas.microsoft.com/office/word/2015/wordml/symex" xmlns:wpg="http://schemas.microsoft.com/office/word/2010/wordprocessingGroup" xmlns:wpi="http://schemas.microsoft.com/office/word/2010/wordprocessingInk" xmlns:wne="http://schemas.microsoft.com/office/word/2006/wordml" xmlns:wps="http://schemas.microsoft.com/office/word/2010/wordprocessingShape" mc:Ignorable="w14 w15 w16se w16cid w16 w16cex w16sdtdh w16sdtfl w16du wp14">
+  <w15:person w15:author="Sammel, Mary">
+    <w15:presenceInfo w15:providerId="AD" w15:userId="S::mary.sammel@cuanschutz.edu::b176c2b8-f018-4c07-abac-efb5cdd73349"/>
+  </w15:person>
+</w15:people>
 </file>
 
 <file path=word/styles.xml><?xml version="1.0" encoding="utf-8"?>
@@ -3572,15 +3742,6 @@
 </file>
 
 <file path=customXml/item1.xml><?xml version="1.0" encoding="utf-8"?>
-<?mso-contentType ?>
-<FormTemplates xmlns="http://schemas.microsoft.com/sharepoint/v3/contenttype/forms">
-  <Display>DocumentLibraryForm</Display>
-  <Edit>DocumentLibraryForm</Edit>
-  <New>DocumentLibraryForm</New>
-</FormTemplates>
-</file>
-
-<file path=customXml/item2.xml><?xml version="1.0" encoding="utf-8"?>
 <p:properties xmlns:p="http://schemas.microsoft.com/office/2006/metadata/properties" xmlns:xsi="http://www.w3.org/2001/XMLSchema-instance" xmlns:pc="http://schemas.microsoft.com/office/infopath/2007/PartnerControls">
   <documentManagement>
     <TeamsChannelId xmlns="01b6a1d5-879d-44ed-91a0-31c394f626b4" xsi:nil="true"/>
@@ -3635,11 +3796,11 @@
 </p:properties>
 </file>
 
-<file path=customXml/item3.xml><?xml version="1.0" encoding="utf-8"?>
+<file path=customXml/item2.xml><?xml version="1.0" encoding="utf-8"?>
 <b:Sources xmlns:b="http://schemas.openxmlformats.org/officeDocument/2006/bibliography" xmlns="http://schemas.openxmlformats.org/officeDocument/2006/bibliography" SelectedStyle="\APASixthEditionOfficeOnline.xsl" StyleName="APA" Version="6"/>
 </file>
 
-<file path=customXml/item4.xml><?xml version="1.0" encoding="utf-8"?>
+<file path=customXml/item3.xml><?xml version="1.0" encoding="utf-8"?>
 <ct:contentTypeSchema xmlns:ct="http://schemas.microsoft.com/office/2006/metadata/contentType" xmlns:ma="http://schemas.microsoft.com/office/2006/metadata/properties/metaAttributes" ct:_="" ma:_="" ma:contentTypeName="Document" ma:contentTypeID="0x010100D9900BBE3463A2459DB82DA98F64B4A0" ma:contentTypeVersion="38" ma:contentTypeDescription="Create a new document." ma:contentTypeScope="" ma:versionID="dcee0fda95fa28944246b56b90b7f7a3">
   <xsd:schema xmlns:xsd="http://www.w3.org/2001/XMLSchema" xmlns:xs="http://www.w3.org/2001/XMLSchema" xmlns:p="http://schemas.microsoft.com/office/2006/metadata/properties" xmlns:ns2="01b6a1d5-879d-44ed-91a0-31c394f626b4" xmlns:ns3="57eaa26b-6fb5-4fc8-8b16-530ac3965dc8" targetNamespace="http://schemas.microsoft.com/office/2006/metadata/properties" ma:root="true" ma:fieldsID="bcfcad32e24c9ae598e43146dc149adb" ns2:_="" ns3:_="">
     <xsd:import namespace="01b6a1d5-879d-44ed-91a0-31c394f626b4"/>
@@ -4082,15 +4243,16 @@
 </ct:contentTypeSchema>
 </file>
 
-<file path=customXml/itemProps1.xml><?xml version="1.0" encoding="utf-8"?>
-<ds:datastoreItem xmlns:ds="http://schemas.openxmlformats.org/officeDocument/2006/customXml" ds:itemID="{5AC28F30-25C5-40E2-86AC-997E9D14A90B}">
-  <ds:schemaRefs>
-    <ds:schemaRef ds:uri="http://schemas.microsoft.com/sharepoint/v3/contenttype/forms"/>
-  </ds:schemaRefs>
-</ds:datastoreItem>
+<file path=customXml/item4.xml><?xml version="1.0" encoding="utf-8"?>
+<?mso-contentType ?>
+<FormTemplates xmlns="http://schemas.microsoft.com/sharepoint/v3/contenttype/forms">
+  <Display>DocumentLibraryForm</Display>
+  <Edit>DocumentLibraryForm</Edit>
+  <New>DocumentLibraryForm</New>
+</FormTemplates>
 </file>
 
-<file path=customXml/itemProps2.xml><?xml version="1.0" encoding="utf-8"?>
+<file path=customXml/itemProps1.xml><?xml version="1.0" encoding="utf-8"?>
 <ds:datastoreItem xmlns:ds="http://schemas.openxmlformats.org/officeDocument/2006/customXml" ds:itemID="{5E415542-6724-4A23-B3D4-85865AE81BFB}">
   <ds:schemaRefs>
     <ds:schemaRef ds:uri="http://schemas.microsoft.com/office/2006/metadata/properties"/>
@@ -4101,7 +4263,7 @@
 </ds:datastoreItem>
 </file>
 
-<file path=customXml/itemProps3.xml><?xml version="1.0" encoding="utf-8"?>
+<file path=customXml/itemProps2.xml><?xml version="1.0" encoding="utf-8"?>
 <ds:datastoreItem xmlns:ds="http://schemas.openxmlformats.org/officeDocument/2006/customXml" ds:itemID="{083A482D-5E67-482B-8C41-09908A898153}">
   <ds:schemaRefs>
     <ds:schemaRef ds:uri="http://schemas.openxmlformats.org/officeDocument/2006/bibliography"/>
@@ -4109,7 +4271,7 @@
 </ds:datastoreItem>
 </file>
 
-<file path=customXml/itemProps4.xml><?xml version="1.0" encoding="utf-8"?>
+<file path=customXml/itemProps3.xml><?xml version="1.0" encoding="utf-8"?>
 <ds:datastoreItem xmlns:ds="http://schemas.openxmlformats.org/officeDocument/2006/customXml" ds:itemID="{E4E79D3D-B05D-4EDC-9E90-D67663079556}">
   <ds:schemaRefs>
     <ds:schemaRef ds:uri="http://schemas.microsoft.com/office/2006/metadata/contentType"/>
@@ -4126,4 +4288,12 @@
     <ds:schemaRef ds:uri="http://schemas.microsoft.com/internal/obd"/>
   </ds:schemaRefs>
 </ds:datastoreItem>
+</file>
+
+<file path=customXml/itemProps4.xml><?xml version="1.0" encoding="utf-8"?>
+<ds:datastoreItem xmlns:ds="http://schemas.openxmlformats.org/officeDocument/2006/customXml" ds:itemID="{5AC28F30-25C5-40E2-86AC-997E9D14A90B}">
+  <ds:schemaRefs>
+    <ds:schemaRef ds:uri="http://schemas.microsoft.com/sharepoint/v3/contenttype/forms"/>
+  </ds:schemaRefs>
+</ds:datastoreItem>
 </file>
</xml_diff>